<commit_message>
Fact-check corrections to water scarcity doc
</commit_message>
<xml_diff>
--- a/resources/week1/MUN - Water Bankruptcies.docx
+++ b/resources/week1/MUN - Water Bankruptcies.docx
@@ -3670,7 +3670,7 @@
           <w:szCs w:val="20"/>
           <w:rtl w:val="0"/>
         </w:rPr>
-        <w:t xml:space="preserve">With 50% of Brazil's energy coming from hydropower, low water levels also increase the risk of energy shortages. </w:t>
+        <w:t xml:space="preserve">With approximately 50-55% of Brazil's energy coming from hydropower, low water levels also increase the risk of energy shortages. </w:t>
       </w:r>
     </w:p>
     <w:p>
@@ -5192,7 +5192,7 @@
           <w:szCs w:val="20"/>
           <w:rtl w:val="0"/>
         </w:rPr>
-        <w:t xml:space="preserve">99.8% of treated water in Cairo meets WHO guidelines, with 96.6% of households connected to sewage systems.</w:t>
+        <w:t xml:space="preserve">96.6% of households in Cairo are connected to sewage systems, though water quality remains a challenge in some governorates.</w:t>
       </w:r>
     </w:p>
     <w:p>
@@ -5264,7 +5264,7 @@
           <w:szCs w:val="20"/>
           <w:rtl w:val="0"/>
         </w:rPr>
-        <w:t xml:space="preserve">Egypt operates around 100 desalination plants, producing 1.2 million m3 per day.</w:t>
+        <w:t xml:space="preserve">Egypt operates around 125 desalination plants, producing 1.31 million m3 per day.</w:t>
       </w:r>
     </w:p>
     <w:p>
@@ -8013,7 +8013,7 @@
           <w:szCs w:val="20"/>
           <w:rtl w:val="0"/>
         </w:rPr>
-        <w:t xml:space="preserve">The critical Cutzamala reservoir system has historically dropped to critical levels (e.g., 26.7% in 2023, recovering slightly to ~53% in 2025). </w:t>
+        <w:t xml:space="preserve">The critical Cutzamala reservoir system has historically dropped to critical levels (e.g., 26.7% in mid-2024, recovering slightly to ~53% in 2025). </w:t>
       </w:r>
     </w:p>
     <w:p>
@@ -8773,7 +8773,7 @@
           <w:szCs w:val="20"/>
           <w:rtl w:val="0"/>
         </w:rPr>
-        <w:t xml:space="preserve">Between 2015 and 2018, Cape Town faced a severe, 1-in-400-year drought. The city came within weeks of losing municipal water supply when dam levels fell to just 13.5% of capacity, narrowly avoiding "Day Zero" (when taps would turn off).</w:t>
+        <w:t xml:space="preserve">Between 2015 and 2018, Cape Town faced a severe, 1-in-400-year drought. The city came within weeks of losing municipal water supply when dam levels approached the critical 13.5% threshold, narrowly avoiding "Day Zero" (when taps would turn off).</w:t>
       </w:r>
     </w:p>
     <w:p>
@@ -9862,7 +9862,7 @@
           <w:szCs w:val="20"/>
           <w:rtl w:val="0"/>
         </w:rPr>
-        <w:t xml:space="preserve">Despite scarcity, Madrid maintains high tap water quality, with less than 1% of the supply affected by significant contamination in recent years. </w:t>
+        <w:t xml:space="preserve">Despite scarcity, Madrid maintains high tap water quality, with tap water quality in major cities remains high, though 33% of rivers nationally show some level of contamination. </w:t>
       </w:r>
     </w:p>
     <w:p>
@@ -9899,7 +9899,7 @@
           <w:szCs w:val="20"/>
           <w:rtl w:val="0"/>
         </w:rPr>
-        <w:t xml:space="preserve">As of mid-August 2025, Spain's reservoirs were at a critical average level of 63.9%, highlighting the precarious nature of water supplies during summer months.</w:t>
+        <w:t xml:space="preserve">As of mid-August 2025, Spain's reservoirs were at a critical average level of 63.9% (Tagus basin), highlighting the precarious nature of water supplies during summer months.</w:t>
       </w:r>
     </w:p>
     <w:p>
@@ -10743,7 +10743,7 @@
             <w:szCs w:val="20"/>
             <w:rtl w:val="0"/>
           </w:rPr>
-          <w:t xml:space="preserve">Relative sea level rise of 17 mm per year</w:t>
+          <w:t xml:space="preserve">Relative sea level rise of approximately 12 mm per year (with additional land subsidence)</w:t>
         </w:r>
       </w:hyperlink>
       <w:r>

</xml_diff>